<commit_message>
added application d forms and updated others
</commit_message>
<xml_diff>
--- a/grant_templates/grant_type_r1_template.docx
+++ b/grant_templates/grant_type_r1_template.docx
@@ -917,22 +917,17 @@
             </w:r>
             <w:r>
               <w:rPr>
-                <w:rFonts w:ascii="Times New Roman" w:cs="Times New Roman" w:eastAsia="Times New Roman" w:hAnsi="Times New Roman"/>
-                <w:b w:val="0"/>
-                <w:bCs w:val="0"/>
                 <w:i w:val="1"/>
                 <w:iCs w:val="1"/>
-                <w:smallCaps w:val="0"/>
-                <w:strike w:val="0"/>
-                <w:color w:val="000000"/>
-                <w:sz w:val="24"/>
-                <w:szCs w:val="24"/>
                 <w:highlight w:val="white"/>
-                <w:u w:val="none"/>
-                <w:vertAlign w:val="baseline"/>
-                <w:rtl w:val="0"/>
-              </w:rPr>
-              <w:t xml:space="preserve">&lt;наименование ОУП/НП&gt;</w:t>
+                <w:rtl w:val="0"/>
+              </w:rPr>
+              <w:t xml:space="preserve">{name_of_np}</w:t>
+            </w:r>
+            <w:r>
+              <w:rPr>
+                <w:rtl w:val="0"/>
+              </w:rPr>
             </w:r>
           </w:p>
           <w:p>
@@ -9657,7 +9652,7 @@
         <w:rPr>
           <w:rtl w:val="0"/>
         </w:rPr>
-        <w:t xml:space="preserve">Настоящим письмом __________{organization_name}____________________</w:t>
+        <w:t xml:space="preserve">Настоящим письмом __________{organization_name}__________________</w:t>
       </w:r>
       <w:r>
         <w:rPr>

</xml_diff>